<commit_message>
docs: parches del prototipo aplicados (12 oct) + informe actualizado
- Aplicados en wispr_terminal_professional (con autorización): XSS en
  studentScoreChart, /api/kali/diagnose sin versiones para estudiantes y con
  límite, contraseña 8-64 en el registro, nodemailer 10.0.11 (npm audit: 0).
  Respaldo de originales en ~/wispr_terminal_professional_respaldo_2026-10-12/.
- Verificado: servidor arranca (copia con node-pty sustituido), diagnóstico
  con sesión real, validación en el navegador sin errores JS.
- Informe .docx regenerado; generador guardado en docs/.

Co-Authored-By: Claude Opus 5.5 <noreply@anthropic.com>
</commit_message>
<xml_diff>
--- a/docs/Informe_pruebas_seguridad_WISPR.docx
+++ b/docs/Informe_pruebas_seguridad_WISPR.docx
@@ -408,7 +408,7 @@
               <w:rPr>
                 <w:sz w:val="19"/>
               </w:rPr>
-              <w:t>Sin cambios necesarios en el backend. Parche para el prototipo</w:t>
+              <w:t>Sin cambios en el backend; corregida la ruta de diagnóstico del prototipo</w:t>
             </w:r>
           </w:p>
         </w:tc>
@@ -773,7 +773,7 @@
               <w:rPr>
                 <w:sz w:val="19"/>
               </w:rPr>
-              <w:t>0 vulnerabilidades (Python) y 0 (npm, con el parche)</w:t>
+              <w:t>0 vulnerabilidades en Python y 0 en npm</w:t>
             </w:r>
           </w:p>
         </w:tc>
@@ -1151,7 +1151,7 @@
         <w:rPr>
           <w:i w:val="0"/>
         </w:rPr>
-        <w:t>Se preparó un parche para el servidor del prototipo (docs/parches/frontend-server.js.patch): las versiones solo se muestran a administradores, el estudiante ve únicamente el estado de su propio contenedor, y se permite un diagnóstico cada 10 segundos por jugador. Se verificó ejecutando la función con un Docker simulado:</w:t>
+        <w:t>Se corrigió el servidor del prototipo (docs/parches/frontend-server.js.patch, aplicado): las versiones solo se muestran a administradores, el estudiante ve únicamente el estado de su propio contenedor, y se permite un diagnóstico cada 10 segundos por jugador. Resultado con una sesión real de estudiante, después de aplicar el cambio:</w:t>
       </w:r>
     </w:p>
     <w:tbl>
@@ -1179,7 +1179,7 @@
                 <w:rFonts w:ascii="Consolas" w:hAnsi="Consolas" w:eastAsia="Consolas"/>
                 <w:sz w:val="17"/>
               </w:rPr>
-              <w:t>estudiante: versión docker no | versión node no | ve su contenedor SÍ</w:t>
+              <w:t>$ curl -H "Authorization: Bearer &lt;token de estudiante&gt;" http://127.0.0.1:8799/api/kali/diagnose</w:t>
             </w:r>
           </w:p>
           <w:p>
@@ -1191,7 +1191,79 @@
                 <w:rFonts w:ascii="Consolas" w:hAnsi="Consolas" w:eastAsia="Consolas"/>
                 <w:sz w:val="17"/>
               </w:rPr>
-              <w:t>admin:      versión docker SÍ | versión node SÍ | ve su contenedor SÍ</w:t>
+              <w:t>WISPR diagnóstico 2026-10-12T06:09:00.629Z</w:t>
+            </w:r>
+          </w:p>
+          <w:p>
+            <w:pPr>
+              <w:spacing w:after="0"/>
+            </w:pPr>
+            <w:r>
+              <w:rPr>
+                <w:rFonts w:ascii="Consolas" w:hAnsi="Consolas" w:eastAsia="Consolas"/>
+                <w:sz w:val="17"/>
+              </w:rPr>
+              <w:t>build kali=idle target=idle</w:t>
+            </w:r>
+          </w:p>
+          <w:p>
+            <w:pPr>
+              <w:spacing w:after="0"/>
+            </w:pPr>
+            <w:r>
+              <w:rPr>
+                <w:rFonts w:ascii="Consolas" w:hAnsi="Consolas" w:eastAsia="Consolas"/>
+                <w:sz w:val="17"/>
+              </w:rPr>
+              <w:t>FAIL red wispr-net-53fe4ed383a3ec            (FAIL: el equipo de prueba no tiene Docker)</w:t>
+            </w:r>
+          </w:p>
+          <w:p>
+            <w:pPr>
+              <w:spacing w:after="0"/>
+            </w:pPr>
+            <w:r>
+              <w:rPr>
+                <w:rFonts w:ascii="Consolas" w:hAnsi="Consolas" w:eastAsia="Consolas"/>
+                <w:sz w:val="17"/>
+              </w:rPr>
+              <w:t>FAIL contenedor wispr-kali-53fe4ed383a3ec</w:t>
+            </w:r>
+          </w:p>
+          <w:p>
+            <w:pPr>
+              <w:spacing w:after="0"/>
+            </w:pPr>
+            <w:r>
+              <w:rPr>
+                <w:rFonts w:ascii="Consolas" w:hAnsi="Consolas" w:eastAsia="Consolas"/>
+                <w:sz w:val="17"/>
+              </w:rPr>
+              <w:t>...                                          -&gt; ya no aparecen versiones de Docker, Node ni del sistema</w:t>
+            </w:r>
+          </w:p>
+          <w:p>
+            <w:pPr>
+              <w:spacing w:after="0"/>
+            </w:pPr>
+            <w:r>
+              <w:rPr>
+                <w:rFonts w:ascii="Consolas" w:hAnsi="Consolas" w:eastAsia="Consolas"/>
+                <w:sz w:val="17"/>
+              </w:rPr>
+              <w:t>$ (segundo pedido inmediato)</w:t>
+            </w:r>
+          </w:p>
+          <w:p>
+            <w:pPr>
+              <w:spacing w:after="0"/>
+            </w:pPr>
+            <w:r>
+              <w:rPr>
+                <w:rFonts w:ascii="Consolas" w:hAnsi="Consolas" w:eastAsia="Consolas"/>
+                <w:sz w:val="17"/>
+              </w:rPr>
+              <w:t>{"ok":false,"error":"Espera unos segundos antes de volver a diagnosticar."}   [HTTP 429]</w:t>
             </w:r>
           </w:p>
         </w:tc>
@@ -1218,7 +1290,7 @@
         <w:rPr>
           <w:i w:val="0"/>
         </w:rPr>
-        <w:t>Aprobado en el backend. El parche del prototipo debe aplicarlo el equipo de frontend (ver sección 4).</w:t>
+        <w:t>Aprobado. La debilidad encontrada en el prototipo quedó corregida.</w:t>
       </w:r>
     </w:p>
     <w:p>
@@ -1884,7 +1956,7 @@
         <w:spacing w:after="40"/>
       </w:pPr>
       <w:r>
-        <w:t>Frontend: parche que escapa el nombre en el gráfico del profesor (docs/parches/frontend-app.js.patch). Verificado en Chromium: antes el script del atacante se ejecutaba; con el parche, no, y el nombre aparece como texto.</w:t>
+        <w:t>Frontend: el gráfico del profesor ahora escapa el nombre antes de insertarlo (docs/parches/frontend-app.js.patch, aplicado). Verificado en Chromium: antes el script del atacante se ejecutaba; ahora no, y el nombre aparece como texto. El formulario de registro también exige ahora entre 8 y 64 caracteres, igual que el servidor.</w:t>
       </w:r>
     </w:p>
     <w:p>
@@ -2031,7 +2103,7 @@
         <w:rPr>
           <w:i w:val="0"/>
         </w:rPr>
-        <w:t>Corregido en el backend, con pruebas automáticas que lo cubren. Parche del frontend listo para aplicar.</w:t>
+        <w:t>Corregido en el backend (con pruebas automáticas que lo cubren) y en el frontend.</w:t>
       </w:r>
     </w:p>
     <w:p>
@@ -3815,7 +3887,7 @@
                 <w:rFonts w:ascii="Consolas" w:hAnsi="Consolas" w:eastAsia="Consolas"/>
                 <w:sz w:val="17"/>
               </w:rPr>
-              <w:t>npm audit con nodemailer 10.0.11 (sobre una copia de package-lock.json):</w:t>
+              <w:t>npm audit en el prototipo, con nodemailer 10.0.11 instalado:</w:t>
             </w:r>
           </w:p>
           <w:p>
@@ -3854,7 +3926,7 @@
         <w:rPr>
           <w:i w:val="0"/>
         </w:rPr>
-        <w:t>Corregido en el backend. En el prototipo, se aplica con npm install nodemailer@10.0.11 (ver sección 4). Recomendación: repetir ambas auditorías antes de cada entrega, porque cada semana se publican vulnerabilidades nuevas.</w:t>
+        <w:t>Corregido en el backend y en el prototipo. Recomendación: repetir ambas auditorías antes de cada entrega, porque cada semana se publican vulnerabilidades nuevas.</w:t>
       </w:r>
     </w:p>
     <w:p>
@@ -3968,7 +4040,7 @@
         <w:pStyle w:val="Heading1"/>
       </w:pPr>
       <w:r>
-        <w:t>4. Correcciones preparadas para el prototipo</w:t>
+        <w:t>4. Correcciones aplicadas al prototipo</w:t>
       </w:r>
     </w:p>
     <w:p>
@@ -3979,7 +4051,7 @@
         <w:rPr>
           <w:i w:val="0"/>
         </w:rPr>
-        <w:t>El prototipo wispr_terminal_professional no está bajo control de versiones (Git), así que no se modificó directamente: un cambio ahí no se podría deshacer con seguridad. Cada corrección se preparó y verificó sobre una copia, y quedó como archivo de parche en docs/parches/ con instrucciones (LEEME.md). Para aplicarlas, desde esa carpeta:</w:t>
+        <w:t>El prototipo wispr_terminal_professional no está bajo control de versiones (Git). Por eso cada corrección se preparó y verificó primero sobre una copia, se guardó como archivo de parche en docs/parches/ y se aplicó el 12 de octubre después de respaldar los archivos originales. Después de aplicarlas se comprobó que el servidor arranca y responde, que la interfaz carga sin errores de JavaScript y que npm audit no reporta vulnerabilidades. Para aplicarlas en otra copia del prototipo:</w:t>
       </w:r>
     </w:p>
     <w:tbl>
@@ -4288,15 +4360,6 @@
       </w:pPr>
       <w:r>
         <w:t>Obtener la sección 12 y medir la restauración completa (3.7).</w:t>
-      </w:r>
-    </w:p>
-    <w:p>
-      <w:pPr>
-        <w:pStyle w:val="ListBullet"/>
-        <w:spacing w:after="40"/>
-      </w:pPr>
-      <w:r>
-        <w:t>Que el equipo de frontend aplique los tres parches de la sección 4.</w:t>
       </w:r>
     </w:p>
     <w:p>

</xml_diff>